<commit_message>
feat: ask for personal-data, profile-visibility and analytics consents separately
Sign-in no longer bundles consent into the user agreement checkbox: the
agreement is accepted by the button, and a separate "Show your profile?"
screen (art. 10.1 of 152-FZ) and an analytics consent follow. Existing
accounts keep profileVisibility = legacy and are asked on next open; old
clients without consentReview also get legacy. Public player and search
lists go through publicProfileWhere and serializePublicUserPreview.

Deploy order: prisma/deploy/20260924_separate_consents.sql, then the
server, then the clients.

Co-Authored-By: Claude Opus 5.5 <noreply@anthropic.com>
</commit_message>
<xml_diff>
--- a/docs/legal/2026-09-08/deliverables/00_Инструкция_и_сведения_для_РКН.docx
+++ b/docs/legal/2026-09-08/deliverables/00_Инструкция_и_сведения_для_РКН.docx
@@ -2177,6 +2177,101 @@
         <w:pStyle w:val="Heading1"/>
       </w:pPr>
       <w:r>
+        <w:t>4а Сделано 24 сентября 2026 года</w:t>
+      </w:r>
+    </w:p>
+    <w:p>
+      <w:r>
+        <w:t>В коде реализованы раздельные согласия (ветка claude/separate-consents, в production ещё не выпущено). Пункты 1–4 раздела 4 закрыты так:</w:t>
+      </w:r>
+    </w:p>
+    <w:p>
+      <w:pPr>
+        <w:pStyle w:val="ListBullet"/>
+      </w:pPr>
+      <w:r>
+        <w:t>Вход: галочки «принимаю соглашение и даю согласие на обработку ПД» больше нет ни в web, ни в iOS, ни в Android. Соглашение принимается нажатием кнопки входа, рядом ссылка на соглашение и политику. В журнале принятий для новой редакции 2026-09-24 согласие на обработку ПД не записывается; для прежних редакций запись сохраняется как была.</w:t>
+      </w:r>
+    </w:p>
+    <w:p>
+      <w:pPr>
+        <w:pStyle w:val="ListBullet"/>
+      </w:pPr>
+      <w:r>
+        <w:t>Согласие на показ анкеты (документ 04): отдельный экран после анкеты с кнопкой-согласием, выбором групп сведений и аудитории, полем ФИО. Каждое решение — отдельная запись журнала UserConsent с версией текста.</w:t>
+      </w:r>
+    </w:p>
+    <w:p>
+      <w:pPr>
+        <w:pStyle w:val="ListBullet"/>
+      </w:pPr>
+      <w:r>
+        <w:t>Сервер показывает анкету в поиске, на карте, в гостевой выдаче, каталоге центров и дайджесте срочных поисков только при согласии и в пределах выбранных групп. Гостям — только при отдельном разрешении. Для срочных и регулярных поисков нужен пункт «Мои игровые поиски».</w:t>
+      </w:r>
+    </w:p>
+    <w:p>
+      <w:pPr>
+        <w:pStyle w:val="ListBullet"/>
+      </w:pPr>
+      <w:r>
+        <w:t>Аналитика (форма 03 В): события пишутся только при согласии, при отзыве удаляются, хранение ограничено 90 днями с автоматической очисткой.</w:t>
+      </w:r>
+    </w:p>
+    <w:p>
+      <w:pPr>
+        <w:pStyle w:val="ListBullet"/>
+      </w:pPr>
+      <w:r>
+        <w:t>Тексты на сайте: исправлены соглашение и политика, опубликованы /legal/profile-visibility и /legal/analytics.</w:t>
+      </w:r>
+    </w:p>
+    <w:p>
+      <w:r>
+        <w:t>Решения владельца и связанные риски:</w:t>
+      </w:r>
+    </w:p>
+    <w:p>
+      <w:pPr>
+        <w:pStyle w:val="ListBullet"/>
+      </w:pPr>
+      <w:r>
+        <w:t>Действующие аккаунты не скрываются: до ответа они видны как прежде и получают экран «Мы обновили правила» при следующем открытии приложения. Кто нажал «Скрыть анкету», скрывается сразу. Кто не открывает приложение, продолжает показываться без действующего согласия — рекомендуется напоминание и срок для ответа.</w:t>
+      </w:r>
+    </w:p>
+    <w:p>
+      <w:pPr>
+        <w:pStyle w:val="ListBullet"/>
+      </w:pPr>
+      <w:r>
+        <w:t>Старые версии iOS и Android не знают об экране согласия. Их новые пользователи получают прежнее поведение, пока не обновят приложение. После выхода новой версии рекомендуется поднять минимальную версию приложения (механизм minVersion уже есть).</w:t>
+      </w:r>
+    </w:p>
+    <w:p>
+      <w:pPr>
+        <w:pStyle w:val="ListBullet"/>
+      </w:pPr>
+      <w:r>
+        <w:t>Аналитика останавливается для всех, кто не дал согласия. События, собранные до 24 сентября без отдельного согласия, пока не удалены — решение за владельцем.</w:t>
+      </w:r>
+    </w:p>
+    <w:p>
+      <w:pPr>
+        <w:pStyle w:val="ListBullet"/>
+      </w:pPr>
+      <w:r>
+        <w:t>Прежний режим iOS/Android «Ограниченный профиль» хранился только на телефоне и ничего не скрывал; он заменён разделом «Видимость и согласия».</w:t>
+      </w:r>
+    </w:p>
+    <w:p>
+      <w:r>
+        <w:t>Не сделано: форма 03 Б (геопозиция) — см. статус в документе 03; уведомление РКН по статье 22 и отдельное уведомление о трансграничной передаче; незаполненные поля документов 02, 06, 07.</w:t>
+      </w:r>
+    </w:p>
+    <w:p>
+      <w:pPr>
+        <w:pStyle w:val="Heading1"/>
+      </w:pPr>
+      <w:r>
         <w:t>5 Вопросы для адресной проверки юристом</w:t>
       </w:r>
     </w:p>
@@ -2198,6 +2293,11 @@
     <w:p>
       <w:r>
         <w:t>Публичность и контент. Проверить форму распространения по приказу № 18, ресурсы и реальный контроль условий, лицензию на пользовательские материалы, правомерность публикации сведений участников и изображения третьих лиц. Отдельно проверить лицензии карт, геосправочников, импортируемых клубных материалов и название сервиса.</w:t>
+      </w:r>
+    </w:p>
+    <w:p>
+      <w:r>
+        <w:t>Раздельные согласия. Подтвердить пять решений, принятых при внедрении: согласие на показ даётся кнопкой, а переключатели групп до первого ответа включены; запрет передачи за пределы сервиса установлен одинаково для всех и опубликован в политике, без отдельной галочки; описание, фото и видео профиля обрабатываются по соглашению без формы 03 А; определение города по координатам без формы 03 Б; действующие аккаунты видны до ответа на экран согласия.</w:t>
       </w:r>
     </w:p>
     <w:p>

</xml_diff>

<commit_message>
docs(legal): operator is now an individual entrepreneur (ОГРНИП 326470400131678)
The owner registered as an individual entrepreneur on 2026-10-01 and stays
on the professional income tax. The privacy policy (new edition
2026-10-01, not something users accept) and the lawyer drafts 00, 01, 02,
05, 06, 07 and 08 now name the operator as an individual entrepreneur
with the ОГРНИП.

The accepted user agreement and the consent texts keep naming the operator
by name and INN: it is the same person with the same INN, so the consents
already given stay valid. Document 00 asks the lawyer whether a new
agreement edition is needed.

Co-Authored-By: Claude Opus 5.5 <noreply@anthropic.com>
</commit_message>
<xml_diff>
--- a/docs/legal/2026-09-08/deliverables/00_Инструкция_и_сведения_для_РКН.docx
+++ b/docs/legal/2026-09-08/deliverables/00_Инструкция_и_сведения_для_РКН.docx
@@ -12,7 +12,7 @@
     </w:p>
     <w:p>
       <w:r>
-        <w:t>Инструкция владельцу и сведения для Роскомнадзора. Подготовлено 8 сентября 2026 года для бесплатного приложения без рекламы. Оператор — Захаров Матвей Владимирович, физическое лицо на НПД, ИНН 471803649801. Контакт из проекта: support@sportsearch.shop.</w:t>
+        <w:t>Инструкция владельцу и сведения для Роскомнадзора. Подготовлено 8 сентября 2026 года для бесплатного приложения без рекламы. Оператор — индивидуальный предприниматель Захаров Матвей Владимирович на НПД, ИНН 471803649801, ОГРНИП 326470400131678. Контакт из проекта: support@sportsearch.shop.</w:t>
       </w:r>
     </w:p>
     <w:p>
@@ -769,7 +769,7 @@
     </w:p>
     <w:p>
       <w:r>
-        <w:t xml:space="preserve">Подтверждено пользователем: приложение бесплатно, рекламы нет, владелец применяет НПД. ФИО, ИНН, email и отсутствие статуса ИП подтверждены владельцем. Новое название НаТреню указано владельцем; SportSearch — прежнее имя в коде, TennisSearch — название репозитория. Основной адрес </w:t>
+        <w:t xml:space="preserve">Подтверждено пользователем: приложение бесплатно, рекламы нет, владелец применяет НПД. ФИО, ИНН и email подтверждены владельцем. 1 октября 2026 года владелец сообщил о регистрации индивидуальным предпринимателем (ОГРНИП 326470400131678) с сохранением НПД. Новое название НаТреню указано владельцем; SportSearch — прежнее имя в коде, TennisSearch — название репозитория. Основной адрес </w:t>
       </w:r>
       <w:hyperlink r:id="rId11">
         <w:r>
@@ -1319,7 +1319,7 @@
     </w:p>
     <w:p>
       <w:r>
-        <w:t>Оператор: Захаров Матвей Владимирович. Категория: физическое лицо, применяющее НПД; без статуса ИП, подтверждено владельцем. ИНН: 471803649801. Адрес: 187420, Россия, г. Сясьстрой, ул. Космонавтов, д. 8, кв. 15.</w:t>
+        <w:t>Оператор: Захаров Матвей Владимирович. Категория: индивидуальный предприниматель, применяющий НПД. ИНН: 471803649801. ОГРНИП: 326470400131678. Адрес: 187420, Россия, г. Сясьстрой, ул. Космонавтов, д. 8, кв. 15.</w:t>
       </w:r>
     </w:p>
     <w:p>
@@ -2296,6 +2296,11 @@
     <w:p>
       <w:r>
         <w:t>Авторизация. Реализовано: пользователь, указавший «Россия», входит только по SMS-коду на российский мобильный номер или через VK ID; email, Apple и Google доступны при выборе «Другая страна». Проверить по части 10 статьи 8 закона № 149-ФЗ: достаточно ли самостоятельного указания страны; квалифицируется ли собственная SMS-авторизация как авторизация «с использованием абонентского номера оператора подвижной радиотелефонной связи»; соответствует ли VK ID требованию о российской информационной системе; как поступить со старыми аккаунтами без телефона, которые не привязали номер. Отдельно — правило App Store 4.8: при стороннем входе (VK ID) должен быть доступен равноценный вариант; Sign in with Apple остаётся в приложении в режиме «Другая страна».</w:t>
+      </w:r>
+    </w:p>
+    <w:p>
+      <w:r>
+        <w:t>Статус оператора. С 1 октября 2026 года оператор — индивидуальный предприниматель на НПД (ОГРНИП 326470400131678); ИНН прежний. Принятые редакции соглашения и согласий называют оператора по ФИО и ИНН. Проверить, что они остаются действительными без повторного принятия, и нужна ли новая редакция пользовательского соглашения с реквизитами ИП и способами входа по SMS и VK ID (повторное принятие в сервисе — одно нажатие на экране «Мы обновили правила»).</w:t>
       </w:r>
     </w:p>
     <w:p>

</xml_diff>

<commit_message>
docs(legal): RKN notification draft for an individual operator
Draft 09 now files as an individual, as the published documents name the
operator: no OGRNIP, the 2026-10-07 policy as the reference, SMS.ru out of
the recipients while SMS sign-in is off, and a list of changes that need a
follow-up letter within 10 working days. Draft 00 records that the
2026-10-07 policy covers VK ID. DOCX for 00 and 09 rebuilt.

Co-Authored-By: Claude Opus 5.5 <noreply@anthropic.com>
</commit_message>
<xml_diff>
--- a/docs/legal/2026-09-08/deliverables/00_Инструкция_и_сведения_для_РКН.docx
+++ b/docs/legal/2026-09-08/deliverables/00_Инструкция_и_сведения_для_РКН.docx
@@ -1150,7 +1150,7 @@
               <w:rPr>
                 <w:sz w:val="18"/>
               </w:rPr>
-              <w:t>Яндекс Клауд; вход в России — SMS-код на российский номер (отправка через SMS.ru) или VK ID; вне России — код на email, Apple-вход, Google-вход; push, карты; аналитика внутренняя</w:t>
+              <w:t>Яндекс Клауд; вход в России — код на email (собственная система входа) или VK ID, SMS-код через SMS.ru — если включён; вне России — код на email, Apple-вход, Google-вход; push, карты; аналитика внутренняя</w:t>
             </w:r>
           </w:p>
         </w:tc>
@@ -1289,7 +1289,7 @@
     </w:p>
     <w:p>
       <w:r>
-        <w:t>Вход с 26 сентября 2026 года. При регистрации пользователь сам указывает страну. Для «Россия» доступны только SMS-код на российский мобильный номер (собственная система входа; SMS отправляет SMS.ru по поручению оператора — получает номер и текст сообщения с кодом) и VK ID (оператор получает от VK идентификатор, имя, фамилию и подтверждённый номер телефона в объёме разрешения vkid.personal_info и phone). Код на email, Apple и Google доступны только при выборе «Другая страна». Коды хранятся в виде хеша, действуют 5 минут, допускают 5 попыток; число SMS в сутки ограничено. Реквизиты SMS.ru и ООО «ВК» сверить с фактическими договорами и условиями до указания в уведомлении.</w:t>
+        <w:t>Вход с 5 октября 2026 года (первая версия — 26 сентября). При регистрации пользователь сам указывает страну. Для «Россия» доступны код на email (собственная система входа оператора: код отправляет и проверяет сервер оператора) и VK ID (оператор получает от VK идентификатор, имя, фамилию и подтверждённый номер телефона в объёме разрешения vkid.personal_info и phone). Вход по SMS-коду на российский мобильный номер реализован (SMS отправляет SMS.ru по поручению оператора — получает номер и текст сообщения с кодом), но включается отдельным переключателем на сервере и на 5 октября 2026 года выключен. Apple и Google — иностранные сервисы входа — доступны только при выборе «Другая страна». Коды хранятся в виде хеша, действуют 5 минут, допускают 5 попыток; число SMS в сутки ограничено. Реквизиты SMS.ru и ООО «ВК» сверить с фактическими договорами и условиями до указания в уведомлении.</w:t>
       </w:r>
     </w:p>
     <w:p>
@@ -2272,7 +2272,7 @@
         <w:pStyle w:val="ListBullet"/>
       </w:pPr>
       <w:r>
-        <w:t>Вход для России (26 сентября): страну указывает сам пользователь, документально она не проверяется. Действующие аккаунты с email или Apple не блокируются: после входа им предлагается привязать номер телефона (можно отложить), привязка доступна в настройках аккаунта. Старые версии приложений продолжают входить по email до обновления — после выхода новых версий рекомендуется поднять минимальную версию.</w:t>
+        <w:t>Вход для России (26 сентября): страну указывает сам пользователь, документально она не проверяется. Действующие аккаунты с email входят по коду на email при любом выборе страны. Аккаунт, созданный только через Apple, в режиме «Россия» через Apple не войдёт; автоматическое предложение привязать телефон убрано, привязка номера в настройках видна, только пока включён вход по SMS. Старые версии приложений продолжают входить по email до обновления — после выхода новых версий рекомендуется поднять минимальную версию.</w:t>
       </w:r>
     </w:p>
     <w:p>
@@ -2295,12 +2295,12 @@
     </w:p>
     <w:p>
       <w:r>
-        <w:t>Авторизация. Реализовано: пользователь, указавший «Россия», входит только по SMS-коду на российский мобильный номер или через VK ID; email, Apple и Google доступны при выборе «Другая страна». Проверить по части 10 статьи 8 закона № 149-ФЗ: достаточно ли самостоятельного указания страны; квалифицируется ли собственная SMS-авторизация как авторизация «с использованием абонентского номера оператора подвижной радиотелефонной связи»; соответствует ли VK ID требованию о российской информационной системе; как поступить со старыми аккаунтами без телефона, которые не привязали номер. Отдельно — правило App Store 4.8: при стороннем входе (VK ID) должен быть доступен равноценный вариант; Sign in with Apple остаётся в приложении в режиме «Другая страна».</w:t>
+        <w:t>Авторизация. Реализовано (5 октября 2026 года): пользователь, указавший «Россия», входит по коду на email через собственную систему входа оператора или через VK ID; вход по SMS-коду реализован и включается на сервере (сейчас выключен); Apple и Google доступны при выборе «Другая страна». Проверить по части 10 статьи 8 закона № 149-ФЗ: достаточно ли самостоятельного указания страны; подпадает ли собственный вход по коду на email под пункт 4 (иная информационная система, владелец которой — гражданин России без иного гражданства, соответствующая статье 16); соответствует ли VK ID требованию о российской информационной системе. Отдельно — правило App Store 4.8: при стороннем входе (VK ID) должен быть доступен равноценный вариант; Sign in with Apple остаётся в приложении в режиме «Другая страна».</w:t>
       </w:r>
     </w:p>
     <w:p>
       <w:r>
-        <w:t>Статус оператора. С 1 октября 2026 года оператор — индивидуальный предприниматель на НПД (ОГРНИП 326470400131678); ИНН прежний. Принятые редакции соглашения и согласий называют оператора по ФИО и ИНН. Проверить, что согласия остаются действительными без повторного получения. Решение владельца: пользовательское соглашение выпускается в новой редакции от 1 октября 2026 года (реквизиты ИП, вход по SMS и VK ID); действующие пользователи принимают её на экране «Мы обновили правила». Сборки приложений до 1 октября принимают прежнюю редакцию от 24 сентября — это фиксируется как есть, после обновления приложения человек принимает новую.</w:t>
+        <w:t>Статус оператора. С 1 октября 2026 года оператор — индивидуальный предприниматель на НПД (ОГРНИП 326470400131678); ИНН прежний. Принятые редакции соглашения и согласий называют оператора по ФИО и ИНН. Проверить, что согласия остаются действительными без повторного получения. Решение владельца (5 октября 2026 года): опубликованы документы в редакции от 5 октября 2026 года, оператор в них пока указан как физическое лицо; переход на реквизиты ИП отложен. Действующие пользователи принимают новую редакцию на экране «Мы обновили правила». Сборки приложений до 5 октября принимают прежнюю редакцию от 24 сентября — это фиксируется как есть, после обновления приложения человек принимает новую. Политика обработки персональных данных в редакции от 7 октября 2026 года описывает вход через VK ID (идентификатор VK, имя, фамилия, подтверждённый номер телефона) и срок сеанса 180 дней с последней активности; соглашение и согласия не менялись, повторного принятия не требуется.</w:t>
       </w:r>
     </w:p>
     <w:p>

</xml_diff>